<commit_message>
docs: add 85% RTP model spreadsheet + overview; refresh 97% docs
Each RTP model now has its own reviewer package, generated from the current par
sheet so labels (re-themed: White Hat, Straw Pig, Horseshoe, Brick Pig, Wood
Pig) and numbers are accurate and consistent:

- Big_Bad_Wolf_Saloon_Math_Model_85%_RTP.xlsx + _Overview_85%_RTP.docx — the new
  Lean model: scaled pays (e.g. Yellow Hat 1.57/6.28/31.42), scaled bonus awards
  (brick 6.43–38.79, 128× jackpot), and its measured metrics (RTP 85.25%, base
  43.46% / bonus 41.80%, σ 8.11, max win 1,082×, avg bonus 75.1×).
- Refreshed the 97% .xlsx/.docx with the current symbol labels and figures.

Both workbooks keep live Excel formulas (totals, landing probabilities, award
expectations), recalc on open, and were checked for zero formula errors. Both
docs open with a "How the math was verified" summary and note the companion
model + the RNG/max-win caveats.

Co-Authored-By: Claude Opus 4.8 <noreply@anthropic.com>
</commit_message>
<xml_diff>
--- a/docs/Big_Bad_Wolf_Saloon_Math_Overview_97%_RTP.docx
+++ b/docs/Big_Bad_Wolf_Saloon_Math_Overview_97%_RTP.docx
@@ -27,7 +27,7 @@
           <w:sz w:val="26"/>
           <w:szCs w:val="26"/>
         </w:rPr>
-        <w:t xml:space="preserve">Math Verification Summary &amp; Plain-English Overview</w:t>
+        <w:t xml:space="preserve">Math Verification &amp; Overview — Standard model (97% RTP)</w:t>
       </w:r>
     </w:p>
     <w:p>
@@ -42,7 +42,7 @@
           <w:sz w:val="20"/>
           <w:szCs w:val="20"/>
         </w:rPr>
-        <w:t xml:space="preserve">5×3 video slot · 243 ways · Theoretical RTP ≈ 97%</w:t>
+        <w:t xml:space="preserve">5×3 video slot · 243 ways · selectable RTP model</w:t>
       </w:r>
     </w:p>
     <w:tbl>
@@ -194,7 +194,7 @@
                 <w:sz w:val="20"/>
                 <w:szCs w:val="20"/>
               </w:rPr>
-              <w:t xml:space="preserve">Math verification summary &amp; overview (companion to the formal Math Specification)</w:t>
+              <w:t xml:space="preserve">Math verification summary &amp; overview — Standard (97% RTP) model</w:t>
             </w:r>
           </w:p>
         </w:tc>
@@ -261,7 +261,7 @@
                 <w:sz w:val="20"/>
                 <w:szCs w:val="20"/>
               </w:rPr>
-              <w:t xml:space="preserve">1.0 · 30 May 2026</w:t>
+              <w:t xml:space="preserve">1.0 · 31 May 2026</w:t>
             </w:r>
           </w:p>
         </w:tc>
@@ -328,7 +328,7 @@
                 <w:sz w:val="20"/>
                 <w:szCs w:val="20"/>
               </w:rPr>
-              <w:t xml:space="preserve">git 6df4eab</w:t>
+              <w:t xml:space="preserve">git cefc206</w:t>
             </w:r>
           </w:p>
         </w:tc>
@@ -364,7 +364,7 @@
                 <w:sz w:val="20"/>
                 <w:szCs w:val="20"/>
               </w:rPr>
-              <w:t xml:space="preserve">Companion files</w:t>
+              <w:t xml:space="preserve">This model</w:t>
             </w:r>
           </w:p>
         </w:tc>
@@ -395,7 +395,7 @@
                 <w:sz w:val="20"/>
                 <w:szCs w:val="20"/>
               </w:rPr>
-              <w:t xml:space="preserve">Big_Bad_Wolf_Saloon_Math_Model.xlsx · MATH_SPECIFICATION.md · PARSHEET.md</w:t>
+              <w:t xml:space="preserve">Standard — win-magnitude scale 1× vs the canonical pays/awards</w:t>
             </w:r>
           </w:p>
         </w:tc>
@@ -431,6 +431,140 @@
                 <w:sz w:val="20"/>
                 <w:szCs w:val="20"/>
               </w:rPr>
+              <w:t xml:space="preserve">Companion model</w:t>
+            </w:r>
+          </w:p>
+        </w:tc>
+        <w:tc>
+          <w:tcPr>
+            <w:tcW w:type="dxa" w:w="6240"/>
+            <w:tcBorders>
+              <w:top w:val="single" w:color="CCCCCC" w:sz="1"/>
+              <w:left w:val="single" w:color="CCCCCC" w:sz="1"/>
+              <w:bottom w:val="single" w:color="CCCCCC" w:sz="1"/>
+              <w:right w:val="single" w:color="CCCCCC" w:sz="1"/>
+            </w:tcBorders>
+            <w:shd w:fill="FFFFFF" w:val="clear"/>
+            <w:tcMar>
+              <w:top w:type="dxa" w:w="60"/>
+              <w:left w:type="dxa" w:w="110"/>
+              <w:bottom w:type="dxa" w:w="60"/>
+              <w:right w:type="dxa" w:w="110"/>
+            </w:tcMar>
+          </w:tcPr>
+          <w:p>
+            <w:pPr>
+              <w:jc w:val="left"/>
+            </w:pPr>
+            <w:r>
+              <w:rPr>
+                <w:color w:val="222222"/>
+                <w:sz w:val="20"/>
+                <w:szCs w:val="20"/>
+              </w:rPr>
+              <w:t xml:space="preserve">The game also ships a Lean 85% RTP model (same reels &amp; feature; win sizes scaled). It has its own .xlsx/.docx.</w:t>
+            </w:r>
+          </w:p>
+        </w:tc>
+      </w:tr>
+      <w:tr>
+        <w:trPr>
+          <w:tblHeader w:val="false"/>
+        </w:trPr>
+        <w:tc>
+          <w:tcPr>
+            <w:tcW w:type="dxa" w:w="3120"/>
+            <w:tcBorders>
+              <w:top w:val="single" w:color="CCCCCC" w:sz="1"/>
+              <w:left w:val="single" w:color="CCCCCC" w:sz="1"/>
+              <w:bottom w:val="single" w:color="CCCCCC" w:sz="1"/>
+              <w:right w:val="single" w:color="CCCCCC" w:sz="1"/>
+            </w:tcBorders>
+            <w:shd w:fill="FFFFFF" w:val="clear"/>
+            <w:tcMar>
+              <w:top w:type="dxa" w:w="60"/>
+              <w:left w:type="dxa" w:w="110"/>
+              <w:bottom w:type="dxa" w:w="60"/>
+              <w:right w:type="dxa" w:w="110"/>
+            </w:tcMar>
+          </w:tcPr>
+          <w:p>
+            <w:pPr>
+              <w:jc w:val="left"/>
+            </w:pPr>
+            <w:r>
+              <w:rPr>
+                <w:color w:val="222222"/>
+                <w:sz w:val="20"/>
+                <w:szCs w:val="20"/>
+              </w:rPr>
+              <w:t xml:space="preserve">Companion spreadsheet</w:t>
+            </w:r>
+          </w:p>
+        </w:tc>
+        <w:tc>
+          <w:tcPr>
+            <w:tcW w:type="dxa" w:w="6240"/>
+            <w:tcBorders>
+              <w:top w:val="single" w:color="CCCCCC" w:sz="1"/>
+              <w:left w:val="single" w:color="CCCCCC" w:sz="1"/>
+              <w:bottom w:val="single" w:color="CCCCCC" w:sz="1"/>
+              <w:right w:val="single" w:color="CCCCCC" w:sz="1"/>
+            </w:tcBorders>
+            <w:shd w:fill="FFFFFF" w:val="clear"/>
+            <w:tcMar>
+              <w:top w:type="dxa" w:w="60"/>
+              <w:left w:type="dxa" w:w="110"/>
+              <w:bottom w:type="dxa" w:w="60"/>
+              <w:right w:type="dxa" w:w="110"/>
+            </w:tcMar>
+          </w:tcPr>
+          <w:p>
+            <w:pPr>
+              <w:jc w:val="left"/>
+            </w:pPr>
+            <w:r>
+              <w:rPr>
+                <w:color w:val="222222"/>
+                <w:sz w:val="20"/>
+                <w:szCs w:val="20"/>
+              </w:rPr>
+              <w:t xml:space="preserve">Big_Bad_Wolf_Saloon_Math_Model_97%_RTP.xlsx</w:t>
+            </w:r>
+          </w:p>
+        </w:tc>
+      </w:tr>
+      <w:tr>
+        <w:trPr>
+          <w:tblHeader w:val="false"/>
+        </w:trPr>
+        <w:tc>
+          <w:tcPr>
+            <w:tcW w:type="dxa" w:w="3120"/>
+            <w:tcBorders>
+              <w:top w:val="single" w:color="CCCCCC" w:sz="1"/>
+              <w:left w:val="single" w:color="CCCCCC" w:sz="1"/>
+              <w:bottom w:val="single" w:color="CCCCCC" w:sz="1"/>
+              <w:right w:val="single" w:color="CCCCCC" w:sz="1"/>
+            </w:tcBorders>
+            <w:shd w:fill="FFFFFF" w:val="clear"/>
+            <w:tcMar>
+              <w:top w:type="dxa" w:w="60"/>
+              <w:left w:type="dxa" w:w="110"/>
+              <w:bottom w:type="dxa" w:w="60"/>
+              <w:right w:type="dxa" w:w="110"/>
+            </w:tcMar>
+          </w:tcPr>
+          <w:p>
+            <w:pPr>
+              <w:jc w:val="left"/>
+            </w:pPr>
+            <w:r>
+              <w:rPr>
+                <w:color w:val="222222"/>
+                <w:sz w:val="20"/>
+                <w:szCs w:val="20"/>
+              </w:rPr>
               <w:t xml:space="preserve">Prepared for</w:t>
             </w:r>
           </w:p>
@@ -499,7 +633,7 @@
         <w:t xml:space="preserve">Bottom line: </w:t>
       </w:r>
       <w:r>
-        <w:t xml:space="preserve">the game returns ~97% of stake to players over the long run, confirmed by a 50-million-spin simulation run through the exact code the live game executes. The number you see in the in-game MATH panel, the headless verifier, and this document all come from the same math.</w:t>
+        <w:t xml:space="preserve">the "Standard" model returns ~97% of stake to players over the long run, confirmed by a 50,000,000-spin simulation run through the exact code the live game executes.</w:t>
       </w:r>
     </w:p>
     <w:p>
@@ -527,7 +661,7 @@
         <w:t xml:space="preserve">One source of truth. </w:t>
       </w:r>
       <w:r>
-        <w:t xml:space="preserve">All pay values, reel strips and bonus rules live in two files (par-sheet.js and mathcore.js). The live game and the verifier import the same files — so what is tested is exactly what players get; there is no separate re-implementation to drift out of sync.</w:t>
+        <w:t xml:space="preserve">All pay values, reel strips and bonus rules live in two files (par-sheet.js and mathcore.js). The live game and the verifier import the same files, so what is tested is exactly what players get.</w:t>
       </w:r>
     </w:p>
     <w:p>
@@ -544,10 +678,10 @@
           <w:b/>
           <w:bCs/>
         </w:rPr>
-        <w:t xml:space="preserve">Monte-Carlo simulation. </w:t>
-      </w:r>
-      <w:r>
-        <w:t xml:space="preserve">The verifier (tools/sim.js) plays millions of independent spins through the real evaluation logic and measures RTP, hit frequency, trigger rate, volatility and the per-symbol return. The headline figures here are a 50,000,000-spin run; the statistical error on the total RTP is about ±0.13% (1σ).</w:t>
+        <w:t xml:space="preserve">Selectable model. </w:t>
+      </w:r>
+      <w:r>
+        <w:t xml:space="preserve">The "Standard" model keeps the SAME reels, trigger rate, hit frequency and volatility shape as the other model and scales every win magnitude (line pays + bonus awards) by 1×. The scale is applied once at load.</w:t>
       </w:r>
     </w:p>
     <w:p>
@@ -564,10 +698,10 @@
           <w:b/>
           <w:bCs/>
         </w:rPr>
-        <w:t xml:space="preserve">Faithful accounting. </w:t>
-      </w:r>
-      <w:r>
-        <w:t xml:space="preserve">A spin that triggers the bonus pays the bonus only (its base line wins are forfeited), exactly as the live game does. The verifier models this, so the reported base-game RTP reflects what players actually receive.</w:t>
+        <w:t xml:space="preserve">Monte-Carlo simulation. </w:t>
+      </w:r>
+      <w:r>
+        <w:t xml:space="preserve">The verifier plays 50,000,000 independent spins through the real evaluation logic and measures RTP, hit frequency, trigger rate, volatility and per-symbol return. The statistical error on the total RTP is about ±0.1–0.2% (1σ).</w:t>
       </w:r>
     </w:p>
     <w:p>
@@ -584,42 +718,10 @@
           <w:b/>
           <w:bCs/>
         </w:rPr>
-        <w:t xml:space="preserve">Independent cross-checks. </w:t>
-      </w:r>
-      <w:r>
-        <w:t xml:space="preserve">(a) The base game can be enumerated exactly — there are only 36,729,792 equally-likely screens — to confirm the base RTP to full precision. (b) The bonus average cross-checks against the closed-form expected award per house tier. (c) The in-game MATH and SIM panels run the same math and agree within simulation noise.</w:t>
-      </w:r>
-    </w:p>
-    <w:p>
-      <w:pPr>
-        <w:pStyle w:val="Heading2"/>
-      </w:pPr>
-      <w:r>
-        <w:t xml:space="preserve">Reproduce it yourself</w:t>
-      </w:r>
-    </w:p>
-    <w:p>
-      <w:pPr>
-        <w:spacing w:after="120"/>
-      </w:pPr>
-      <w:r>
-        <w:rPr>
-          <w:rFonts w:ascii="Courier New" w:cs="Courier New" w:eastAsia="Courier New" w:hAnsi="Courier New"/>
-          <w:sz w:val="20"/>
-          <w:szCs w:val="20"/>
-        </w:rPr>
-        <w:t xml:space="preserve">node tools/sim.js 50000000</w:t>
-      </w:r>
-      <w:r>
-        <w:t xml:space="preserve">   — prints RTP (base/bonus/total), trigger rate, hit frequency, volatility, per-symbol contribution and bonus-buy pricing.</w:t>
-      </w:r>
-    </w:p>
-    <w:p>
-      <w:pPr>
-        <w:pStyle w:val="Heading2"/>
-      </w:pPr>
-      <w:r>
-        <w:t xml:space="preserve">Two items the reviewer must note</w:t>
+        <w:t xml:space="preserve">Faithful accounting. </w:t>
+      </w:r>
+      <w:r>
+        <w:t xml:space="preserve">A spin that triggers the bonus pays the bonus only (its base line wins are forfeited), exactly as the live game does.</w:t>
       </w:r>
     </w:p>
     <w:p>
@@ -636,10 +738,39 @@
           <w:b/>
           <w:bCs/>
         </w:rPr>
-        <w:t xml:space="preserve">RNG. </w:t>
-      </w:r>
-      <w:r>
-        <w:t xml:space="preserve">The reference build uses the standard JavaScript random generator (Math.random). That is NOT a certified RNG and must be replaced with a GLI-certified RNG before real-money play. The math is RNG-agnostic — it only assumes independent, uniform draws — so swapping in a certified RNG changes none of the numbers in this document.</w:t>
+        <w:t xml:space="preserve">Independent cross-checks. </w:t>
+      </w:r>
+      <w:r>
+        <w:t xml:space="preserve">The base game can be enumerated exactly (36,729,792 equally-likely screens); the bonus average cross-checks against the closed-form expected award per house tier; and the in-game MATH and SIM panels run the same math.</w:t>
+      </w:r>
+    </w:p>
+    <w:p>
+      <w:pPr>
+        <w:pStyle w:val="Heading2"/>
+      </w:pPr>
+      <w:r>
+        <w:t xml:space="preserve">Reproduce it yourself</w:t>
+      </w:r>
+    </w:p>
+    <w:p>
+      <w:pPr>
+        <w:spacing w:after="120"/>
+      </w:pPr>
+      <w:r>
+        <w:rPr>
+          <w:rFonts w:ascii="Courier New" w:cs="Courier New" w:eastAsia="Courier New" w:hAnsi="Courier New"/>
+          <w:sz w:val="20"/>
+          <w:szCs w:val="20"/>
+        </w:rPr>
+        <w:t xml:space="preserve">BBW_RTP_MODEL=standard node tools/sim.js 50000000</w:t>
+      </w:r>
+    </w:p>
+    <w:p>
+      <w:pPr>
+        <w:pStyle w:val="Heading2"/>
+      </w:pPr>
+      <w:r>
+        <w:t xml:space="preserve">Two items the reviewer must note</w:t>
       </w:r>
     </w:p>
     <w:p>
@@ -656,10 +787,30 @@
           <w:b/>
           <w:bCs/>
         </w:rPr>
+        <w:t xml:space="preserve">RNG. </w:t>
+      </w:r>
+      <w:r>
+        <w:t xml:space="preserve">The reference build uses the standard JavaScript random generator (Math.random). That is NOT a certified RNG and must be replaced with a GLI-certified RNG before real-money play. The math is RNG-agnostic, so swapping in a certified RNG changes none of these numbers.</w:t>
+      </w:r>
+    </w:p>
+    <w:p>
+      <w:pPr>
+        <w:pStyle w:val="ListParagraph"/>
+        <w:numPr>
+          <w:ilvl w:val="0"/>
+          <w:numId w:val="2"/>
+        </w:numPr>
+        <w:spacing w:after="60"/>
+      </w:pPr>
+      <w:r>
+        <w:rPr>
+          <w:b/>
+          <w:bCs/>
+        </w:rPr>
         <w:t xml:space="preserve">Maximum win. </w:t>
       </w:r>
       <w:r>
-        <w:t xml:space="preserve">No maximum-win cap is implemented. The largest win seen in 50M spins was 1,274× stake, but the theoretical maximum is higher. If a jurisdiction requires a published max win or a cap, one must be specified and added.</w:t>
+        <w:t xml:space="preserve">No maximum-win cap is implemented. The largest win seen was 1,274× stake, but the theoretical maximum is higher. If a jurisdiction requires a published max win or a cap, one must be specified.</w:t>
       </w:r>
     </w:p>
     <w:p>
@@ -1624,7 +1775,7 @@
                 <w:sz w:val="20"/>
                 <w:szCs w:val="20"/>
               </w:rPr>
-              <w:t xml:space="preserve">Largest win in 50M spins</w:t>
+              <w:t xml:space="preserve">Largest win in sim</w:t>
             </w:r>
           </w:p>
         </w:tc>
@@ -1927,7 +2078,7 @@
         <w:spacing w:after="120"/>
       </w:pPr>
       <w:r>
-        <w:t xml:space="preserve">There are no fixed paylines. A symbol pays when it lands on consecutive reels starting from the leftmost reel, in any row positions. The number of “ways” is the product of how many times the symbol appears on each of those reels.</w:t>
+        <w:t xml:space="preserve">There are no fixed paylines. A symbol pays when it lands on consecutive reels starting from the leftmost reel, in any rows. The number of “ways” is the product of how many times the symbol appears on each of those reels.</w:t>
       </w:r>
     </w:p>
     <w:p>
@@ -1959,7 +2110,7 @@
         <w:t xml:space="preserve">Span</w:t>
       </w:r>
       <w:r>
-        <w:t xml:space="preserve"> = how many consecutive reels from reel 1 the symbol covers (must be at least 3 to pay).</w:t>
+        <w:t xml:space="preserve"> = how many consecutive reels from reel 1 the symbol covers (at least 3 to pay).</w:t>
       </w:r>
     </w:p>
     <w:p>
@@ -1979,7 +2130,7 @@
         <w:t xml:space="preserve">Ways</w:t>
       </w:r>
       <w:r>
-        <w:t xml:space="preserve"> = product of the symbol’s counts on each covered reel (up to 3×3×3×3×3 = 243).</w:t>
+        <w:t xml:space="preserve"> = product of the symbol’s counts on each covered reel (up to 243).</w:t>
       </w:r>
     </w:p>
     <w:p>
@@ -2000,22 +2151,7 @@
         <w:spacing w:after="120"/>
       </w:pPr>
       <w:r>
-        <w:rPr>
-          <w:b/>
-          <w:bCs/>
-        </w:rPr>
-        <w:t xml:space="preserve">Example. </w:t>
-      </w:r>
-      <w:r>
-        <w:t xml:space="preserve">If, after the wild expands, Aces appear with counts (2, 1, 3, 1, 0) across the five reels, the span is 4 reels, ways = 2×1×3×1 = 6, and the 4-of-a-kind Ace pay is 0.89, so the win is 6 × 0.89 × stake = 5.34× stake.</w:t>
-      </w:r>
-    </w:p>
-    <w:p>
-      <w:pPr>
-        <w:spacing w:after="120"/>
-      </w:pPr>
-      <w:r>
-        <w:t xml:space="preserve">The full pay table for all 15 symbols is in the spreadsheet (</w:t>
+        <w:t xml:space="preserve">The full pay table for all 15 symbols is in the companion spreadsheet (</w:t>
       </w:r>
       <w:r>
         <w:rPr>
@@ -2025,7 +2161,7 @@
         <w:t xml:space="preserve">Paytable</w:t>
       </w:r>
       <w:r>
-        <w:t xml:space="preserve"> sheet) and the formal specification.</w:t>
+        <w:t xml:space="preserve"> sheet).</w:t>
       </w:r>
     </w:p>
     <w:p>
@@ -2088,6 +2224,41 @@
     </w:p>
     <w:p>
       <w:pPr>
+        <w:spacing w:after="120"/>
+      </w:pPr>
+      <w:r>
+        <w:rPr>
+          <w:b/>
+          <w:bCs/>
+        </w:rPr>
+        <w:t xml:space="preserve">Why this matters: </w:t>
+      </w:r>
+      <w:r>
+        <w:t xml:space="preserve">because the wild has no pay, its entire return shows up inside the symbols it helps — chiefly the royals on the centre reel. That is why royals lead the base-game return; most of that is really the wild’s contribution.</w:t>
+      </w:r>
+    </w:p>
+    <w:p>
+      <w:pPr>
+        <w:pStyle w:val="Heading1"/>
+        <w:pageBreakBefore/>
+      </w:pPr>
+      <w:r>
+        <w:t xml:space="preserve">5.  The bonus — Hard Hat Free Spins</w:t>
+      </w:r>
+    </w:p>
+    <w:p>
+      <w:pPr>
+        <w:pBdr>
+          <w:bottom w:val="single" w:color="2E5B28" w:sz="6" w:space="1"/>
+        </w:pBdr>
+        <w:spacing w:after="120" w:before="60"/>
+      </w:pPr>
+      <w:r>
+        <w:t xml:space="preserve"/>
+      </w:r>
+    </w:p>
+    <w:p>
+      <w:pPr>
         <w:pStyle w:val="ListParagraph"/>
         <w:numPr>
           <w:ilvl w:val="0"/>
@@ -2096,42 +2267,14 @@
         <w:spacing w:after="60"/>
       </w:pPr>
       <w:r>
-        <w:t xml:space="preserve">A wild is visible on the centre reel about 9% of spins.</w:t>
-      </w:r>
-    </w:p>
-    <w:p>
-      <w:pPr>
-        <w:spacing w:after="120"/>
-      </w:pPr>
-      <w:r>
         <w:rPr>
           <w:b/>
           <w:bCs/>
         </w:rPr>
-        <w:t xml:space="preserve">Why this matters for the math: </w:t>
-      </w:r>
-      <w:r>
-        <w:t xml:space="preserve">because the wild has no pay, its entire return shows up inside the symbols it helps. The centre reel carries the most low symbols (royals), so when it expands, royal chains extend across the reels. That is why the royals dominate the base-game return table — most of that is really the wild’s contribution, distributed across the symbols it stands in for.</w:t>
-      </w:r>
-    </w:p>
-    <w:p>
-      <w:pPr>
-        <w:pStyle w:val="Heading1"/>
-        <w:pageBreakBefore/>
-      </w:pPr>
-      <w:r>
-        <w:t xml:space="preserve">5.  The bonus — Hard Hat Free Spins</w:t>
-      </w:r>
-    </w:p>
-    <w:p>
-      <w:pPr>
-        <w:pBdr>
-          <w:bottom w:val="single" w:color="2E5B28" w:sz="6" w:space="1"/>
-        </w:pBdr>
-        <w:spacing w:after="120" w:before="60"/>
-      </w:pPr>
-      <w:r>
-        <w:t xml:space="preserve"/>
+        <w:t xml:space="preserve">Trigger: </w:t>
+      </w:r>
+      <w:r>
+        <w:t xml:space="preserve">6+ Hard Hats anywhere awards 6 free spins (about 1 in 179 spins).</w:t>
       </w:r>
     </w:p>
     <w:p>
@@ -2148,30 +2291,10 @@
           <w:b/>
           <w:bCs/>
         </w:rPr>
-        <w:t xml:space="preserve">Trigger: </w:t>
-      </w:r>
-      <w:r>
-        <w:t xml:space="preserve">6 or more Hard Hats anywhere on a spin awards 6 free spins (about 1 in 179 spins).</w:t>
-      </w:r>
-    </w:p>
-    <w:p>
-      <w:pPr>
-        <w:pStyle w:val="ListParagraph"/>
-        <w:numPr>
-          <w:ilvl w:val="0"/>
-          <w:numId w:val="2"/>
-        </w:numPr>
-        <w:spacing w:after="60"/>
-      </w:pPr>
-      <w:r>
-        <w:rPr>
-          <w:b/>
-          <w:bCs/>
-        </w:rPr>
         <w:t xml:space="preserve">Build houses: </w:t>
       </w:r>
       <w:r>
-        <w:t xml:space="preserve">each hat marks its cell and upgrades it on later hits — straw → stick → brick. Frames stay locked for the whole feature.</w:t>
+        <w:t xml:space="preserve">each hat marks its cell and upgrades it — straw → stick → brick. Frames stay locked for the whole feature.</w:t>
       </w:r>
     </w:p>
     <w:p>
@@ -2815,7 +2938,7 @@
         <w:t xml:space="preserve">88× stake</w:t>
       </w:r>
       <w:r>
-        <w:t xml:space="preserve"> to start the feature immediately, from a trigger drawn from the same distribution as a natural one. At that price the buy returns about 97.1% — the same value as spinning for it, so buying is neither better nor worse. (Some regulators restrict feature-buy; it can be disabled by configuration.)</w:t>
+        <w:t xml:space="preserve"> to start the feature immediately, from a trigger drawn from the same distribution as a natural one. At that price the buy returns about 97.1% — the same value as spinning for it.</w:t>
       </w:r>
     </w:p>
     <w:p>
@@ -3085,202 +3208,6 @@
             </w:pPr>
             <w:r>
               <w:rPr>
-                <w:color w:val="222222"/>
-                <w:sz w:val="20"/>
-                <w:szCs w:val="20"/>
-              </w:rPr>
-              <w:t xml:space="preserve">   · ordinary line wins</w:t>
-            </w:r>
-          </w:p>
-        </w:tc>
-        <w:tc>
-          <w:tcPr>
-            <w:tcW w:type="dxa" w:w="2340"/>
-            <w:tcBorders>
-              <w:top w:val="single" w:color="CCCCCC" w:sz="1"/>
-              <w:left w:val="single" w:color="CCCCCC" w:sz="1"/>
-              <w:bottom w:val="single" w:color="CCCCCC" w:sz="1"/>
-              <w:right w:val="single" w:color="CCCCCC" w:sz="1"/>
-            </w:tcBorders>
-            <w:shd w:fill="FFFFFF" w:val="clear"/>
-            <w:tcMar>
-              <w:top w:type="dxa" w:w="60"/>
-              <w:left w:type="dxa" w:w="110"/>
-              <w:bottom w:type="dxa" w:w="60"/>
-              <w:right w:type="dxa" w:w="110"/>
-            </w:tcMar>
-          </w:tcPr>
-          <w:p>
-            <w:pPr>
-              <w:jc w:val="center"/>
-            </w:pPr>
-            <w:r>
-              <w:rPr>
-                <w:color w:val="222222"/>
-                <w:sz w:val="20"/>
-                <w:szCs w:val="20"/>
-              </w:rPr>
-              <w:t xml:space="preserve">≈ 30%</w:t>
-            </w:r>
-          </w:p>
-        </w:tc>
-        <w:tc>
-          <w:tcPr>
-            <w:tcW w:type="dxa" w:w="2340"/>
-            <w:tcBorders>
-              <w:top w:val="single" w:color="CCCCCC" w:sz="1"/>
-              <w:left w:val="single" w:color="CCCCCC" w:sz="1"/>
-              <w:bottom w:val="single" w:color="CCCCCC" w:sz="1"/>
-              <w:right w:val="single" w:color="CCCCCC" w:sz="1"/>
-            </w:tcBorders>
-            <w:shd w:fill="FFFFFF" w:val="clear"/>
-            <w:tcMar>
-              <w:top w:type="dxa" w:w="60"/>
-              <w:left w:type="dxa" w:w="110"/>
-              <w:bottom w:type="dxa" w:w="60"/>
-              <w:right w:type="dxa" w:w="110"/>
-            </w:tcMar>
-          </w:tcPr>
-          <w:p>
-            <w:pPr>
-              <w:jc w:val="center"/>
-            </w:pPr>
-            <w:r>
-              <w:rPr>
-                <w:color w:val="222222"/>
-                <w:sz w:val="20"/>
-                <w:szCs w:val="20"/>
-              </w:rPr>
-              <w:t xml:space="preserve"/>
-            </w:r>
-          </w:p>
-        </w:tc>
-      </w:tr>
-      <w:tr>
-        <w:trPr>
-          <w:tblHeader w:val="false"/>
-        </w:trPr>
-        <w:tc>
-          <w:tcPr>
-            <w:tcW w:type="dxa" w:w="4680"/>
-            <w:tcBorders>
-              <w:top w:val="single" w:color="CCCCCC" w:sz="1"/>
-              <w:left w:val="single" w:color="CCCCCC" w:sz="1"/>
-              <w:bottom w:val="single" w:color="CCCCCC" w:sz="1"/>
-              <w:right w:val="single" w:color="CCCCCC" w:sz="1"/>
-            </w:tcBorders>
-            <w:shd w:fill="FFFFFF" w:val="clear"/>
-            <w:tcMar>
-              <w:top w:type="dxa" w:w="60"/>
-              <w:left w:type="dxa" w:w="110"/>
-              <w:bottom w:type="dxa" w:w="60"/>
-              <w:right w:type="dxa" w:w="110"/>
-            </w:tcMar>
-          </w:tcPr>
-          <w:p>
-            <w:pPr>
-              <w:jc w:val="left"/>
-            </w:pPr>
-            <w:r>
-              <w:rPr>
-                <w:color w:val="222222"/>
-                <w:sz w:val="20"/>
-                <w:szCs w:val="20"/>
-              </w:rPr>
-              <w:t xml:space="preserve">   · expanding wild</w:t>
-            </w:r>
-          </w:p>
-        </w:tc>
-        <w:tc>
-          <w:tcPr>
-            <w:tcW w:type="dxa" w:w="2340"/>
-            <w:tcBorders>
-              <w:top w:val="single" w:color="CCCCCC" w:sz="1"/>
-              <w:left w:val="single" w:color="CCCCCC" w:sz="1"/>
-              <w:bottom w:val="single" w:color="CCCCCC" w:sz="1"/>
-              <w:right w:val="single" w:color="CCCCCC" w:sz="1"/>
-            </w:tcBorders>
-            <w:shd w:fill="FFFFFF" w:val="clear"/>
-            <w:tcMar>
-              <w:top w:type="dxa" w:w="60"/>
-              <w:left w:type="dxa" w:w="110"/>
-              <w:bottom w:type="dxa" w:w="60"/>
-              <w:right w:type="dxa" w:w="110"/>
-            </w:tcMar>
-          </w:tcPr>
-          <w:p>
-            <w:pPr>
-              <w:jc w:val="center"/>
-            </w:pPr>
-            <w:r>
-              <w:rPr>
-                <w:color w:val="222222"/>
-                <w:sz w:val="20"/>
-                <w:szCs w:val="20"/>
-              </w:rPr>
-              <w:t xml:space="preserve">≈ 19%</w:t>
-            </w:r>
-          </w:p>
-        </w:tc>
-        <w:tc>
-          <w:tcPr>
-            <w:tcW w:type="dxa" w:w="2340"/>
-            <w:tcBorders>
-              <w:top w:val="single" w:color="CCCCCC" w:sz="1"/>
-              <w:left w:val="single" w:color="CCCCCC" w:sz="1"/>
-              <w:bottom w:val="single" w:color="CCCCCC" w:sz="1"/>
-              <w:right w:val="single" w:color="CCCCCC" w:sz="1"/>
-            </w:tcBorders>
-            <w:shd w:fill="FFFFFF" w:val="clear"/>
-            <w:tcMar>
-              <w:top w:type="dxa" w:w="60"/>
-              <w:left w:type="dxa" w:w="110"/>
-              <w:bottom w:type="dxa" w:w="60"/>
-              <w:right w:type="dxa" w:w="110"/>
-            </w:tcMar>
-          </w:tcPr>
-          <w:p>
-            <w:pPr>
-              <w:jc w:val="center"/>
-            </w:pPr>
-            <w:r>
-              <w:rPr>
-                <w:color w:val="222222"/>
-                <w:sz w:val="20"/>
-                <w:szCs w:val="20"/>
-              </w:rPr>
-              <w:t xml:space="preserve"/>
-            </w:r>
-          </w:p>
-        </w:tc>
-      </w:tr>
-      <w:tr>
-        <w:trPr>
-          <w:tblHeader w:val="false"/>
-        </w:trPr>
-        <w:tc>
-          <w:tcPr>
-            <w:tcW w:type="dxa" w:w="4680"/>
-            <w:tcBorders>
-              <w:top w:val="single" w:color="CCCCCC" w:sz="1"/>
-              <w:left w:val="single" w:color="CCCCCC" w:sz="1"/>
-              <w:bottom w:val="single" w:color="CCCCCC" w:sz="1"/>
-              <w:right w:val="single" w:color="CCCCCC" w:sz="1"/>
-            </w:tcBorders>
-            <w:shd w:fill="FFFFFF" w:val="clear"/>
-            <w:tcMar>
-              <w:top w:type="dxa" w:w="60"/>
-              <w:left w:type="dxa" w:w="110"/>
-              <w:bottom w:type="dxa" w:w="60"/>
-              <w:right w:type="dxa" w:w="110"/>
-            </w:tcMar>
-          </w:tcPr>
-          <w:p>
-            <w:pPr>
-              <w:jc w:val="left"/>
-            </w:pPr>
-            <w:r>
-              <w:rPr>
                 <w:b/>
                 <w:bCs/>
                 <w:color w:val="222222"/>
@@ -3497,8 +3424,8 @@
         </w:tblBorders>
       </w:tblPr>
       <w:tblGrid>
-        <w:gridCol w:w="3700"/>
-        <w:gridCol w:w="5660"/>
+        <w:gridCol w:w="3900"/>
+        <w:gridCol w:w="5460"/>
       </w:tblGrid>
       <w:tr>
         <w:trPr>
@@ -3506,7 +3433,7 @@
         </w:trPr>
         <w:tc>
           <w:tcPr>
-            <w:tcW w:type="dxa" w:w="3700"/>
+            <w:tcW w:type="dxa" w:w="3900"/>
             <w:tcBorders>
               <w:top w:val="single" w:color="CCCCCC" w:sz="1"/>
               <w:left w:val="single" w:color="CCCCCC" w:sz="1"/>
@@ -3539,7 +3466,7 @@
         </w:tc>
         <w:tc>
           <w:tcPr>
-            <w:tcW w:type="dxa" w:w="5660"/>
+            <w:tcW w:type="dxa" w:w="5460"/>
             <w:tcBorders>
               <w:top w:val="single" w:color="CCCCCC" w:sz="1"/>
               <w:left w:val="single" w:color="CCCCCC" w:sz="1"/>
@@ -3577,7 +3504,7 @@
         </w:trPr>
         <w:tc>
           <w:tcPr>
-            <w:tcW w:type="dxa" w:w="3700"/>
+            <w:tcW w:type="dxa" w:w="3900"/>
             <w:tcBorders>
               <w:top w:val="single" w:color="CCCCCC" w:sz="1"/>
               <w:left w:val="single" w:color="CCCCCC" w:sz="1"/>
@@ -3604,38 +3531,38 @@
                 <w:sz w:val="20"/>
                 <w:szCs w:val="20"/>
               </w:rPr>
-              <w:t xml:space="preserve">Big_Bad_Wolf_Saloon_Math_Model.xlsx</w:t>
-            </w:r>
-          </w:p>
-        </w:tc>
-        <w:tc>
-          <w:tcPr>
-            <w:tcW w:type="dxa" w:w="5660"/>
-            <w:tcBorders>
-              <w:top w:val="single" w:color="CCCCCC" w:sz="1"/>
-              <w:left w:val="single" w:color="CCCCCC" w:sz="1"/>
-              <w:bottom w:val="single" w:color="CCCCCC" w:sz="1"/>
-              <w:right w:val="single" w:color="CCCCCC" w:sz="1"/>
-            </w:tcBorders>
-            <w:shd w:fill="FFFFFF" w:val="clear"/>
-            <w:tcMar>
-              <w:top w:type="dxa" w:w="60"/>
-              <w:left w:type="dxa" w:w="110"/>
-              <w:bottom w:type="dxa" w:w="60"/>
-              <w:right w:type="dxa" w:w="110"/>
-            </w:tcMar>
-          </w:tcPr>
-          <w:p>
-            <w:pPr>
-              <w:jc w:val="left"/>
-            </w:pPr>
-            <w:r>
-              <w:rPr>
-                <w:color w:val="222222"/>
-                <w:sz w:val="20"/>
-                <w:szCs w:val="20"/>
-              </w:rPr>
-              <w:t xml:space="preserve">This spreadsheet: summary, read-me, full pay table, reel counts, exact reel strips, landing probabilities, bonus award math, per-symbol RTP, and constants. Totals/probabilities/expectations are live Excel formulas.</w:t>
+              <w:t xml:space="preserve">Big_Bad_Wolf_Saloon_Math_Model_97%_RTP.xlsx</w:t>
+            </w:r>
+          </w:p>
+        </w:tc>
+        <w:tc>
+          <w:tcPr>
+            <w:tcW w:type="dxa" w:w="5460"/>
+            <w:tcBorders>
+              <w:top w:val="single" w:color="CCCCCC" w:sz="1"/>
+              <w:left w:val="single" w:color="CCCCCC" w:sz="1"/>
+              <w:bottom w:val="single" w:color="CCCCCC" w:sz="1"/>
+              <w:right w:val="single" w:color="CCCCCC" w:sz="1"/>
+            </w:tcBorders>
+            <w:shd w:fill="FFFFFF" w:val="clear"/>
+            <w:tcMar>
+              <w:top w:type="dxa" w:w="60"/>
+              <w:left w:type="dxa" w:w="110"/>
+              <w:bottom w:type="dxa" w:w="60"/>
+              <w:right w:type="dxa" w:w="110"/>
+            </w:tcMar>
+          </w:tcPr>
+          <w:p>
+            <w:pPr>
+              <w:jc w:val="left"/>
+            </w:pPr>
+            <w:r>
+              <w:rPr>
+                <w:color w:val="222222"/>
+                <w:sz w:val="20"/>
+                <w:szCs w:val="20"/>
+              </w:rPr>
+              <w:t xml:space="preserve">This model’s workbook: summary, read-me, full pay table, reel counts, exact reel strips, landing probabilities, bonus award math, per-symbol RTP, and constants. Totals/probabilities/expectations are live Excel formulas.</w:t>
             </w:r>
           </w:p>
         </w:tc>
@@ -3646,7 +3573,7 @@
         </w:trPr>
         <w:tc>
           <w:tcPr>
-            <w:tcW w:type="dxa" w:w="3700"/>
+            <w:tcW w:type="dxa" w:w="3900"/>
             <w:tcBorders>
               <w:top w:val="single" w:color="CCCCCC" w:sz="1"/>
               <w:left w:val="single" w:color="CCCCCC" w:sz="1"/>
@@ -3673,38 +3600,38 @@
                 <w:sz w:val="20"/>
                 <w:szCs w:val="20"/>
               </w:rPr>
-              <w:t xml:space="preserve">MATH_SPECIFICATION.md</w:t>
-            </w:r>
-          </w:p>
-        </w:tc>
-        <w:tc>
-          <w:tcPr>
-            <w:tcW w:type="dxa" w:w="5660"/>
-            <w:tcBorders>
-              <w:top w:val="single" w:color="CCCCCC" w:sz="1"/>
-              <w:left w:val="single" w:color="CCCCCC" w:sz="1"/>
-              <w:bottom w:val="single" w:color="CCCCCC" w:sz="1"/>
-              <w:right w:val="single" w:color="CCCCCC" w:sz="1"/>
-            </w:tcBorders>
-            <w:shd w:fill="FFFFFF" w:val="clear"/>
-            <w:tcMar>
-              <w:top w:type="dxa" w:w="60"/>
-              <w:left w:type="dxa" w:w="110"/>
-              <w:bottom w:type="dxa" w:w="60"/>
-              <w:right w:type="dxa" w:w="110"/>
-            </w:tcMar>
-          </w:tcPr>
-          <w:p>
-            <w:pPr>
-              <w:jc w:val="left"/>
-            </w:pPr>
-            <w:r>
-              <w:rPr>
-                <w:color w:val="222222"/>
-                <w:sz w:val="20"/>
-                <w:szCs w:val="20"/>
-              </w:rPr>
-              <w:t xml:space="preserve">The formal, certification-grade specification: definitions, the exact 243-ways algorithm, the wild and bonus rules, the complete par sheet, RTP analysis, RNG and exposure notes, and the verification methodology.</w:t>
+              <w:t xml:space="preserve">Big_Bad_Wolf_Saloon_Math_Overview_97%_RTP.docx</w:t>
+            </w:r>
+          </w:p>
+        </w:tc>
+        <w:tc>
+          <w:tcPr>
+            <w:tcW w:type="dxa" w:w="5460"/>
+            <w:tcBorders>
+              <w:top w:val="single" w:color="CCCCCC" w:sz="1"/>
+              <w:left w:val="single" w:color="CCCCCC" w:sz="1"/>
+              <w:bottom w:val="single" w:color="CCCCCC" w:sz="1"/>
+              <w:right w:val="single" w:color="CCCCCC" w:sz="1"/>
+            </w:tcBorders>
+            <w:shd w:fill="FFFFFF" w:val="clear"/>
+            <w:tcMar>
+              <w:top w:type="dxa" w:w="60"/>
+              <w:left w:type="dxa" w:w="110"/>
+              <w:bottom w:type="dxa" w:w="60"/>
+              <w:right w:type="dxa" w:w="110"/>
+            </w:tcMar>
+          </w:tcPr>
+          <w:p>
+            <w:pPr>
+              <w:jc w:val="left"/>
+            </w:pPr>
+            <w:r>
+              <w:rPr>
+                <w:color w:val="222222"/>
+                <w:sz w:val="20"/>
+                <w:szCs w:val="20"/>
+              </w:rPr>
+              <w:t xml:space="preserve">This document.</w:t>
             </w:r>
           </w:p>
         </w:tc>
@@ -3715,7 +3642,7 @@
         </w:trPr>
         <w:tc>
           <w:tcPr>
-            <w:tcW w:type="dxa" w:w="3700"/>
+            <w:tcW w:type="dxa" w:w="3900"/>
             <w:tcBorders>
               <w:top w:val="single" w:color="CCCCCC" w:sz="1"/>
               <w:left w:val="single" w:color="CCCCCC" w:sz="1"/>
@@ -3742,38 +3669,38 @@
                 <w:sz w:val="20"/>
                 <w:szCs w:val="20"/>
               </w:rPr>
-              <w:t xml:space="preserve">PARSHEET.md</w:t>
-            </w:r>
-          </w:p>
-        </w:tc>
-        <w:tc>
-          <w:tcPr>
-            <w:tcW w:type="dxa" w:w="5660"/>
-            <w:tcBorders>
-              <w:top w:val="single" w:color="CCCCCC" w:sz="1"/>
-              <w:left w:val="single" w:color="CCCCCC" w:sz="1"/>
-              <w:bottom w:val="single" w:color="CCCCCC" w:sz="1"/>
-              <w:right w:val="single" w:color="CCCCCC" w:sz="1"/>
-            </w:tcBorders>
-            <w:shd w:fill="FFFFFF" w:val="clear"/>
-            <w:tcMar>
-              <w:top w:type="dxa" w:w="60"/>
-              <w:left w:type="dxa" w:w="110"/>
-              <w:bottom w:type="dxa" w:w="60"/>
-              <w:right w:type="dxa" w:w="110"/>
-            </w:tcMar>
-          </w:tcPr>
-          <w:p>
-            <w:pPr>
-              <w:jc w:val="left"/>
-            </w:pPr>
-            <w:r>
-              <w:rPr>
-                <w:color w:val="222222"/>
-                <w:sz w:val="20"/>
-                <w:szCs w:val="20"/>
-              </w:rPr>
-              <w:t xml:space="preserve">A short human-readable par-sheet summary.</w:t>
+              <w:t xml:space="preserve">(companion Lean 85% RTP files)</w:t>
+            </w:r>
+          </w:p>
+        </w:tc>
+        <w:tc>
+          <w:tcPr>
+            <w:tcW w:type="dxa" w:w="5460"/>
+            <w:tcBorders>
+              <w:top w:val="single" w:color="CCCCCC" w:sz="1"/>
+              <w:left w:val="single" w:color="CCCCCC" w:sz="1"/>
+              <w:bottom w:val="single" w:color="CCCCCC" w:sz="1"/>
+              <w:right w:val="single" w:color="CCCCCC" w:sz="1"/>
+            </w:tcBorders>
+            <w:shd w:fill="FFFFFF" w:val="clear"/>
+            <w:tcMar>
+              <w:top w:type="dxa" w:w="60"/>
+              <w:left w:type="dxa" w:w="110"/>
+              <w:bottom w:type="dxa" w:w="60"/>
+              <w:right w:type="dxa" w:w="110"/>
+            </w:tcMar>
+          </w:tcPr>
+          <w:p>
+            <w:pPr>
+              <w:jc w:val="left"/>
+            </w:pPr>
+            <w:r>
+              <w:rPr>
+                <w:color w:val="222222"/>
+                <w:sz w:val="20"/>
+                <w:szCs w:val="20"/>
+              </w:rPr>
+              <w:t xml:space="preserve">The other RTP model’s matching .xlsx and .docx.</w:t>
             </w:r>
           </w:p>
         </w:tc>
@@ -3784,7 +3711,7 @@
         </w:trPr>
         <w:tc>
           <w:tcPr>
-            <w:tcW w:type="dxa" w:w="3700"/>
+            <w:tcW w:type="dxa" w:w="3900"/>
             <w:tcBorders>
               <w:top w:val="single" w:color="CCCCCC" w:sz="1"/>
               <w:left w:val="single" w:color="CCCCCC" w:sz="1"/>
@@ -3817,32 +3744,32 @@
         </w:tc>
         <w:tc>
           <w:tcPr>
-            <w:tcW w:type="dxa" w:w="5660"/>
-            <w:tcBorders>
-              <w:top w:val="single" w:color="CCCCCC" w:sz="1"/>
-              <w:left w:val="single" w:color="CCCCCC" w:sz="1"/>
-              <w:bottom w:val="single" w:color="CCCCCC" w:sz="1"/>
-              <w:right w:val="single" w:color="CCCCCC" w:sz="1"/>
-            </w:tcBorders>
-            <w:shd w:fill="FFFFFF" w:val="clear"/>
-            <w:tcMar>
-              <w:top w:type="dxa" w:w="60"/>
-              <w:left w:type="dxa" w:w="110"/>
-              <w:bottom w:type="dxa" w:w="60"/>
-              <w:right w:type="dxa" w:w="110"/>
-            </w:tcMar>
-          </w:tcPr>
-          <w:p>
-            <w:pPr>
-              <w:jc w:val="left"/>
-            </w:pPr>
-            <w:r>
-              <w:rPr>
-                <w:color w:val="222222"/>
-                <w:sz w:val="20"/>
-                <w:szCs w:val="20"/>
-              </w:rPr>
-              <w:t xml:space="preserve">Canonical, machine-readable par sheet (pays, reel counts, bonus config).</w:t>
+            <w:tcW w:type="dxa" w:w="5460"/>
+            <w:tcBorders>
+              <w:top w:val="single" w:color="CCCCCC" w:sz="1"/>
+              <w:left w:val="single" w:color="CCCCCC" w:sz="1"/>
+              <w:bottom w:val="single" w:color="CCCCCC" w:sz="1"/>
+              <w:right w:val="single" w:color="CCCCCC" w:sz="1"/>
+            </w:tcBorders>
+            <w:shd w:fill="FFFFFF" w:val="clear"/>
+            <w:tcMar>
+              <w:top w:type="dxa" w:w="60"/>
+              <w:left w:type="dxa" w:w="110"/>
+              <w:bottom w:type="dxa" w:w="60"/>
+              <w:right w:type="dxa" w:w="110"/>
+            </w:tcMar>
+          </w:tcPr>
+          <w:p>
+            <w:pPr>
+              <w:jc w:val="left"/>
+            </w:pPr>
+            <w:r>
+              <w:rPr>
+                <w:color w:val="222222"/>
+                <w:sz w:val="20"/>
+                <w:szCs w:val="20"/>
+              </w:rPr>
+              <w:t xml:space="preserve">Canonical par sheet (pays, reel counts, bonus config, RTP_MODELS).</w:t>
             </w:r>
           </w:p>
         </w:tc>
@@ -3853,7 +3780,7 @@
         </w:trPr>
         <w:tc>
           <w:tcPr>
-            <w:tcW w:type="dxa" w:w="3700"/>
+            <w:tcW w:type="dxa" w:w="3900"/>
             <w:tcBorders>
               <w:top w:val="single" w:color="CCCCCC" w:sz="1"/>
               <w:left w:val="single" w:color="CCCCCC" w:sz="1"/>
@@ -3886,7 +3813,7 @@
         </w:tc>
         <w:tc>
           <w:tcPr>
-            <w:tcW w:type="dxa" w:w="5660"/>
+            <w:tcW w:type="dxa" w:w="5460"/>
             <w:tcBorders>
               <w:top w:val="single" w:color="CCCCCC" w:sz="1"/>
               <w:left w:val="single" w:color="CCCCCC" w:sz="1"/>
@@ -3922,7 +3849,7 @@
         </w:trPr>
         <w:tc>
           <w:tcPr>
-            <w:tcW w:type="dxa" w:w="3700"/>
+            <w:tcW w:type="dxa" w:w="3900"/>
             <w:tcBorders>
               <w:top w:val="single" w:color="CCCCCC" w:sz="1"/>
               <w:left w:val="single" w:color="CCCCCC" w:sz="1"/>
@@ -3955,32 +3882,32 @@
         </w:tc>
         <w:tc>
           <w:tcPr>
-            <w:tcW w:type="dxa" w:w="5660"/>
-            <w:tcBorders>
-              <w:top w:val="single" w:color="CCCCCC" w:sz="1"/>
-              <w:left w:val="single" w:color="CCCCCC" w:sz="1"/>
-              <w:bottom w:val="single" w:color="CCCCCC" w:sz="1"/>
-              <w:right w:val="single" w:color="CCCCCC" w:sz="1"/>
-            </w:tcBorders>
-            <w:shd w:fill="FFFFFF" w:val="clear"/>
-            <w:tcMar>
-              <w:top w:type="dxa" w:w="60"/>
-              <w:left w:type="dxa" w:w="110"/>
-              <w:bottom w:type="dxa" w:w="60"/>
-              <w:right w:type="dxa" w:w="110"/>
-            </w:tcMar>
-          </w:tcPr>
-          <w:p>
-            <w:pPr>
-              <w:jc w:val="left"/>
-            </w:pPr>
-            <w:r>
-              <w:rPr>
-                <w:color w:val="222222"/>
-                <w:sz w:val="20"/>
-                <w:szCs w:val="20"/>
-              </w:rPr>
-              <w:t xml:space="preserve">Headless Monte-Carlo verifier (run it to reproduce every figure).</w:t>
+            <w:tcW w:type="dxa" w:w="5460"/>
+            <w:tcBorders>
+              <w:top w:val="single" w:color="CCCCCC" w:sz="1"/>
+              <w:left w:val="single" w:color="CCCCCC" w:sz="1"/>
+              <w:bottom w:val="single" w:color="CCCCCC" w:sz="1"/>
+              <w:right w:val="single" w:color="CCCCCC" w:sz="1"/>
+            </w:tcBorders>
+            <w:shd w:fill="FFFFFF" w:val="clear"/>
+            <w:tcMar>
+              <w:top w:type="dxa" w:w="60"/>
+              <w:left w:type="dxa" w:w="110"/>
+              <w:bottom w:type="dxa" w:w="60"/>
+              <w:right w:type="dxa" w:w="110"/>
+            </w:tcMar>
+          </w:tcPr>
+          <w:p>
+            <w:pPr>
+              <w:jc w:val="left"/>
+            </w:pPr>
+            <w:r>
+              <w:rPr>
+                <w:color w:val="222222"/>
+                <w:sz w:val="20"/>
+                <w:szCs w:val="20"/>
+              </w:rPr>
+              <w:t xml:space="preserve">Headless Monte-Carlo verifier. Run “BBW_RTP_MODEL=standard node tools/sim.js” to reproduce every figure.</w:t>
             </w:r>
           </w:p>
         </w:tc>
@@ -3998,7 +3925,7 @@
         <w:t xml:space="preserve">Note: </w:t>
       </w:r>
       <w:r>
-        <w:t xml:space="preserve">if any value in par-sheet.js changes, re-run the verifier and re-issue this package — every figure here is tied to build 6df4eab.</w:t>
+        <w:t xml:space="preserve">if any value in par-sheet.js changes, re-run the verifier and re-issue this package — every figure here is tied to build cefc206.</w:t>
       </w:r>
     </w:p>
     <w:sectPr>
@@ -4065,7 +3992,7 @@
         <w:sz w:val="16"/>
         <w:szCs w:val="16"/>
       </w:rPr>
-      <w:t xml:space="preserve">Big Bad Wolf Saloon — Math Verification &amp; Overview   ·   Page </w:t>
+      <w:t xml:space="preserve">Big Bad Wolf Saloon — Standard (97% RTP) — Math Verification &amp; Overview   ·   Page </w:t>
     </w:r>
     <w:r>
       <w:rPr>

</xml_diff>